<commit_message>
Chapter 5 Fieldcraft completed.
</commit_message>
<xml_diff>
--- a/resources/essenceOfStoneENWithTOCNoPageNumbers.docx
+++ b/resources/essenceOfStoneENWithTOCNoPageNumbers.docx
@@ -1786,11 +1786,17 @@
       <w:bookmarkEnd w:id="4"/>
     </w:p>
     <w:p>
+      <w:pPr>
+        <w:rPr>
+          <w:lang w:val="en-US"/>
+        </w:rPr>
+      </w:pPr>
       <w:r>
         <w:t>It’s probably time to say a little about myself.</w:t>
       </w:r>
-      <w:r>
-        <w:br/>
+    </w:p>
+    <w:p>
+      <w:r>
         <w:t>My name is Mac.</w:t>
       </w:r>
     </w:p>
@@ -4129,7 +4135,15 @@
         <w:t>Clip</w:t>
       </w:r>
       <w:r>
-        <w:t>, as if he were speaking right beside me:</w:t>
+        <w:t xml:space="preserve">, as if he were </w:t>
+      </w:r>
+      <w:proofErr w:type="gramStart"/>
+      <w:r>
+        <w:t>speaking</w:t>
+      </w:r>
+      <w:proofErr w:type="gramEnd"/>
+      <w:r>
+        <w:t xml:space="preserve"> right beside me:</w:t>
       </w:r>
     </w:p>
     <w:p>
@@ -9031,7 +9045,7 @@
         <w:rPr>
           <w:lang w:val="en-US"/>
         </w:rPr>
-        <w:t xml:space="preserve">Jellyfish </w:t>
+        <w:t>Jellyfish</w:t>
       </w:r>
       <w:r>
         <w:t>—a Creature made of absolute, all-consuming darkness. As if on the outside I remained in the ordinary world, while inside I was trapped in a permanent, unending freeze, composed of impenetrable gloom and bottomless emptiness.</w:t>
@@ -9596,10 +9610,13 @@
         <w:t xml:space="preserve">oaked in syrup, </w:t>
       </w:r>
       <w:r>
-        <w:t>f</w:t>
-      </w:r>
-      <w:r>
-        <w:t>rosted, and decorated with sugar roses.”</w:t>
+        <w:rPr>
+          <w:lang w:val="en-US"/>
+        </w:rPr>
+        <w:t>covered with icing</w:t>
+      </w:r>
+      <w:r>
+        <w:t>, and decorated with sugar roses.”</w:t>
       </w:r>
     </w:p>
     <w:p>

</xml_diff>

<commit_message>
Chapter 10 Warlock Fieldcraft completed.
</commit_message>
<xml_diff>
--- a/resources/essenceOfStoneENWithTOCNoPageNumbers.docx
+++ b/resources/essenceOfStoneENWithTOCNoPageNumbers.docx
@@ -19966,7 +19966,13 @@
     </w:p>
     <w:p>
       <w:r>
-        <w:t>“If I’m honest? Not great,” he replied, dropping into a chair out of habit and taking an appreciative first sip of coffee. “Not the picking itself—that went smoothly. No incidents. I mean what’s going on there in general. We were in the Seventh Variant. Most of their key technologies are built around nuclear energy. Which means the states—or rather, entire blocs—are locked in a brutal struggle for nuclear fuel. It’s reached the point where a global catastrophe nearly unfolded. The way it once did in the Fourth Variant.”</w:t>
+        <w:t xml:space="preserve">“If I’m honest? Not great,” he replied, dropping into a chair out of habit and taking an appreciative first sip of coffee. “Not the picking itself—that went smoothly. No incidents. I mean what’s going on there in general. We were in the Seventh Variant. </w:t>
+      </w:r>
+      <w:r>
+        <w:t>As you already know, m</w:t>
+      </w:r>
+      <w:r>
+        <w:t>ost of their key technologies are built around nuclear energy. Which means the states—or rather, entire blocs—are locked in a brutal struggle for nuclear fuel. It’s reached the point where a global catastrophe nearly unfolded. The way it once did in the Fourth Variant.”</w:t>
       </w:r>
     </w:p>
     <w:p>
@@ -20355,7 +20361,7 @@
         <w:t>“</w:t>
       </w:r>
       <w:r>
-        <w:t>Cuel</w:t>
+        <w:t>Cue</w:t>
       </w:r>
       <w:r>
         <w:t>l, could you please tell us, in general terms, about the concept behind your menu and what you might recommend tonight?”</w:t>
@@ -22021,10 +22027,9 @@
     </w:p>
     <w:p>
       <w:r>
-        <w:t>One by one, proud and graceful, magnificent dragons were landing in the clearing before us.</w:t>
-      </w:r>
-    </w:p>
-    <w:p/>
+        <w:t>In the clearing before us, proud and graceful, magnificent dragons were landing.</w:t>
+      </w:r>
+    </w:p>
     <w:p/>
     <w:p/>
     <w:sectPr>
@@ -22641,7 +22646,6 @@
   <w:style w:type="character" w:default="1" w:styleId="DefaultParagraphFont">
     <w:name w:val="Default Paragraph Font"/>
     <w:uiPriority w:val="1"/>
-    <w:semiHidden/>
     <w:unhideWhenUsed/>
   </w:style>
   <w:style w:type="table" w:default="1" w:styleId="TableNormal">

</xml_diff>